<commit_message>
manajemen laporan: generate report
</commit_message>
<xml_diff>
--- a/storage/app/templates/laporan-harian/template-laporan-harian.docx
+++ b/storage/app/templates/laporan-harian/template-laporan-harian.docx
@@ -61,7 +61,7 @@
         <w:rPr>
           <w:rFonts w:ascii="Times New Roman" w:hAnsi="Times New Roman" w:cs="Times New Roman"/>
         </w:rPr>
-        <w:t>-</w:t>
+        <w:t>${lokasi}</w:t>
       </w:r>
     </w:p>
     <w:p>
@@ -82,7 +82,19 @@
         <w:rPr>
           <w:rFonts w:ascii="Times New Roman" w:hAnsi="Times New Roman" w:cs="Times New Roman"/>
         </w:rPr>
-        <w:t>-</w:t>
+        <w:t>${</w:t>
+      </w:r>
+      <w:r>
+        <w:rPr>
+          <w:rFonts w:ascii="Times New Roman" w:hAnsi="Times New Roman" w:cs="Times New Roman"/>
+        </w:rPr>
+        <w:t>p</w:t>
+      </w:r>
+      <w:r>
+        <w:rPr>
+          <w:rFonts w:ascii="Times New Roman" w:hAnsi="Times New Roman" w:cs="Times New Roman"/>
+        </w:rPr>
+        <w:t>erusahaan}</w:t>
       </w:r>
     </w:p>
     <w:p>
@@ -149,7 +161,7 @@
         <w:rPr>
           <w:rFonts w:ascii="Times New Roman" w:hAnsi="Times New Roman" w:cs="Times New Roman"/>
         </w:rPr>
-        <w:t>Barge 2020 - 300 FT</w:t>
+        <w:t>${no_kapal}</w:t>
       </w:r>
     </w:p>
     <w:p>
@@ -336,7 +348,7 @@
                 <w:rFonts w:ascii="Times New Roman" w:hAnsi="Times New Roman" w:cs="Times New Roman"/>
                 <w:color w:val="auto"/>
               </w:rPr>
-              <w:t>Berawan</w:t>
+              <w:t>${cuaca_pagi}</w:t>
             </w:r>
           </w:p>
         </w:tc>
@@ -360,7 +372,21 @@
                 <w:rFonts w:ascii="Times New Roman" w:hAnsi="Times New Roman" w:cs="Times New Roman"/>
                 <w:color w:val="auto"/>
               </w:rPr>
-              <w:t>Berawan</w:t>
+              <w:t>${cuaca_</w:t>
+            </w:r>
+            <w:r>
+              <w:rPr>
+                <w:rFonts w:ascii="Times New Roman" w:hAnsi="Times New Roman" w:cs="Times New Roman"/>
+                <w:color w:val="auto"/>
+              </w:rPr>
+              <w:t>siang</w:t>
+            </w:r>
+            <w:r>
+              <w:rPr>
+                <w:rFonts w:ascii="Times New Roman" w:hAnsi="Times New Roman" w:cs="Times New Roman"/>
+                <w:color w:val="auto"/>
+              </w:rPr>
+              <w:t>}</w:t>
             </w:r>
           </w:p>
         </w:tc>
@@ -384,7 +410,21 @@
                 <w:rFonts w:ascii="Times New Roman" w:hAnsi="Times New Roman" w:cs="Times New Roman"/>
                 <w:color w:val="auto"/>
               </w:rPr>
-              <w:t>Berawan</w:t>
+              <w:t>${cuaca_</w:t>
+            </w:r>
+            <w:r>
+              <w:rPr>
+                <w:rFonts w:ascii="Times New Roman" w:hAnsi="Times New Roman" w:cs="Times New Roman"/>
+                <w:color w:val="auto"/>
+              </w:rPr>
+              <w:t>sore</w:t>
+            </w:r>
+            <w:r>
+              <w:rPr>
+                <w:rFonts w:ascii="Times New Roman" w:hAnsi="Times New Roman" w:cs="Times New Roman"/>
+                <w:color w:val="auto"/>
+              </w:rPr>
+              <w:t>}</w:t>
             </w:r>
           </w:p>
         </w:tc>
@@ -432,7 +472,7 @@
                 <w:rFonts w:ascii="Times New Roman" w:hAnsi="Times New Roman" w:cs="Times New Roman"/>
                 <w:color w:val="auto"/>
               </w:rPr>
-              <w:t>Kering</w:t>
+              <w:t>${kelembaban_pagi}</w:t>
             </w:r>
           </w:p>
         </w:tc>
@@ -456,7 +496,21 @@
                 <w:rFonts w:ascii="Times New Roman" w:hAnsi="Times New Roman" w:cs="Times New Roman"/>
                 <w:color w:val="auto"/>
               </w:rPr>
-              <w:t>Kering</w:t>
+              <w:t>${kelembaban_</w:t>
+            </w:r>
+            <w:r>
+              <w:rPr>
+                <w:rFonts w:ascii="Times New Roman" w:hAnsi="Times New Roman" w:cs="Times New Roman"/>
+                <w:color w:val="auto"/>
+              </w:rPr>
+              <w:t>siang</w:t>
+            </w:r>
+            <w:r>
+              <w:rPr>
+                <w:rFonts w:ascii="Times New Roman" w:hAnsi="Times New Roman" w:cs="Times New Roman"/>
+                <w:color w:val="auto"/>
+              </w:rPr>
+              <w:t>}</w:t>
             </w:r>
           </w:p>
         </w:tc>
@@ -478,7 +532,21 @@
                 <w:rFonts w:ascii="Times New Roman" w:hAnsi="Times New Roman" w:cs="Times New Roman"/>
                 <w:color w:val="auto"/>
               </w:rPr>
-              <w:t>Kering</w:t>
+              <w:t>${kelembaban_</w:t>
+            </w:r>
+            <w:r>
+              <w:rPr>
+                <w:rFonts w:ascii="Times New Roman" w:hAnsi="Times New Roman" w:cs="Times New Roman"/>
+                <w:color w:val="auto"/>
+              </w:rPr>
+              <w:t>sore</w:t>
+            </w:r>
+            <w:r>
+              <w:rPr>
+                <w:rFonts w:ascii="Times New Roman" w:hAnsi="Times New Roman" w:cs="Times New Roman"/>
+                <w:color w:val="auto"/>
+              </w:rPr>
+              <w:t>}</w:t>
             </w:r>
           </w:p>
         </w:tc>
@@ -529,14 +597,7 @@
                 <w:rFonts w:ascii="Times New Roman" w:hAnsi="Times New Roman" w:cs="Times New Roman"/>
                 <w:color w:val="auto"/>
               </w:rPr>
-              <w:t>30</w:t>
-            </w:r>
-            <w:r>
-              <w:rPr>
-                <w:rFonts w:ascii="Times New Roman" w:hAnsi="Times New Roman" w:cs="Times New Roman"/>
-                <w:color w:val="auto"/>
-              </w:rPr>
-              <w:t>°</w:t>
+              <w:t>${suhu}</w:t>
             </w:r>
           </w:p>
         </w:tc>
@@ -603,10 +664,10 @@
         <w:tblLook w:val="04A0" w:firstRow="1" w:lastRow="0" w:firstColumn="1" w:lastColumn="0" w:noHBand="0" w:noVBand="1"/>
       </w:tblPr>
       <w:tblGrid>
-        <w:gridCol w:w="917"/>
-        <w:gridCol w:w="2401"/>
-        <w:gridCol w:w="1985"/>
-        <w:gridCol w:w="3697"/>
+        <w:gridCol w:w="1613"/>
+        <w:gridCol w:w="2169"/>
+        <w:gridCol w:w="1894"/>
+        <w:gridCol w:w="3324"/>
       </w:tblGrid>
       <w:tr>
         <w:trPr>
@@ -749,7 +810,25 @@
                 <w:bCs w:val="0"/>
                 <w:color w:val="auto"/>
               </w:rPr>
-              <w:t>1</w:t>
+              <w:t>${</w:t>
+            </w:r>
+            <w:r>
+              <w:rPr>
+                <w:rFonts w:ascii="Times New Roman" w:hAnsi="Times New Roman" w:cs="Times New Roman"/>
+                <w:b w:val="0"/>
+                <w:bCs w:val="0"/>
+                <w:color w:val="auto"/>
+              </w:rPr>
+              <w:t>personel_no</w:t>
+            </w:r>
+            <w:r>
+              <w:rPr>
+                <w:rFonts w:ascii="Times New Roman" w:hAnsi="Times New Roman" w:cs="Times New Roman"/>
+                <w:b w:val="0"/>
+                <w:bCs w:val="0"/>
+                <w:color w:val="auto"/>
+              </w:rPr>
+              <w:t>}</w:t>
             </w:r>
           </w:p>
         </w:tc>
@@ -771,7 +850,21 @@
                 <w:rFonts w:ascii="Times New Roman" w:hAnsi="Times New Roman" w:cs="Times New Roman"/>
                 <w:color w:val="auto"/>
               </w:rPr>
-              <w:t>-</w:t>
+              <w:t>${personel_</w:t>
+            </w:r>
+            <w:r>
+              <w:rPr>
+                <w:rFonts w:ascii="Times New Roman" w:hAnsi="Times New Roman" w:cs="Times New Roman"/>
+                <w:color w:val="auto"/>
+              </w:rPr>
+              <w:t>jabatan</w:t>
+            </w:r>
+            <w:r>
+              <w:rPr>
+                <w:rFonts w:ascii="Times New Roman" w:hAnsi="Times New Roman" w:cs="Times New Roman"/>
+                <w:color w:val="auto"/>
+              </w:rPr>
+              <w:t>}</w:t>
             </w:r>
           </w:p>
         </w:tc>
@@ -793,7 +886,21 @@
                 <w:rFonts w:ascii="Times New Roman" w:hAnsi="Times New Roman" w:cs="Times New Roman"/>
                 <w:color w:val="auto"/>
               </w:rPr>
-              <w:t>-</w:t>
+              <w:t>${personel_</w:t>
+            </w:r>
+            <w:r>
+              <w:rPr>
+                <w:rFonts w:ascii="Times New Roman" w:hAnsi="Times New Roman" w:cs="Times New Roman"/>
+                <w:color w:val="auto"/>
+              </w:rPr>
+              <w:t>status</w:t>
+            </w:r>
+            <w:r>
+              <w:rPr>
+                <w:rFonts w:ascii="Times New Roman" w:hAnsi="Times New Roman" w:cs="Times New Roman"/>
+                <w:color w:val="auto"/>
+              </w:rPr>
+              <w:t>}</w:t>
             </w:r>
           </w:p>
         </w:tc>
@@ -815,7 +922,21 @@
                 <w:rFonts w:ascii="Times New Roman" w:hAnsi="Times New Roman" w:cs="Times New Roman"/>
                 <w:color w:val="auto"/>
               </w:rPr>
-              <w:t>-</w:t>
+              <w:t>${personel_</w:t>
+            </w:r>
+            <w:r>
+              <w:rPr>
+                <w:rFonts w:ascii="Times New Roman" w:hAnsi="Times New Roman" w:cs="Times New Roman"/>
+                <w:color w:val="auto"/>
+              </w:rPr>
+              <w:t>keterangan</w:t>
+            </w:r>
+            <w:r>
+              <w:rPr>
+                <w:rFonts w:ascii="Times New Roman" w:hAnsi="Times New Roman" w:cs="Times New Roman"/>
+                <w:color w:val="auto"/>
+              </w:rPr>
+              <w:t>}</w:t>
             </w:r>
           </w:p>
         </w:tc>
@@ -1641,7 +1762,7 @@
                 <w:sz w:val="22"/>
                 <w:szCs w:val="22"/>
               </w:rPr>
-              <w:t>02 September 2025</w:t>
+              <w:t>${tanggal}</w:t>
             </w:r>
           </w:p>
         </w:tc>
@@ -2143,25 +2264,7 @@
           <w:b/>
           <w:bCs/>
         </w:rPr>
-        <w:t xml:space="preserve">Lampiran </w:t>
-      </w:r>
-      <w:proofErr w:type="gramStart"/>
-      <w:r>
-        <w:rPr>
-          <w:rFonts w:ascii="Times New Roman" w:hAnsi="Times New Roman"/>
-          <w:b/>
-          <w:bCs/>
-        </w:rPr>
-        <w:t>1 :</w:t>
-      </w:r>
-      <w:proofErr w:type="gramEnd"/>
-      <w:r>
-        <w:rPr>
-          <w:rFonts w:ascii="Times New Roman" w:hAnsi="Times New Roman"/>
-          <w:b/>
-          <w:bCs/>
-        </w:rPr>
-        <w:t xml:space="preserve"> Dokumentasi</w:t>
+        <w:t>Lampiran 1 : Dokumentasi</w:t>
       </w:r>
     </w:p>
     <w:p>
@@ -2181,8 +2284,9 @@
         <w:tblLook w:val="04A0" w:firstRow="1" w:lastRow="0" w:firstColumn="1" w:lastColumn="0" w:noHBand="0" w:noVBand="1"/>
       </w:tblPr>
       <w:tblGrid>
-        <w:gridCol w:w="917"/>
-        <w:gridCol w:w="8581"/>
+        <w:gridCol w:w="1519"/>
+        <w:gridCol w:w="4014"/>
+        <w:gridCol w:w="3965"/>
       </w:tblGrid>
       <w:tr>
         <w:trPr>
@@ -2213,7 +2317,7 @@
         </w:tc>
         <w:tc>
           <w:tcPr>
-            <w:tcW w:w="8581" w:type="dxa"/>
+            <w:tcW w:w="4290" w:type="dxa"/>
             <w:vAlign w:val="center"/>
           </w:tcPr>
           <w:p>
@@ -2231,6 +2335,29 @@
                 <w:rFonts w:ascii="Times New Roman" w:hAnsi="Times New Roman"/>
               </w:rPr>
               <w:t>Gambar</w:t>
+            </w:r>
+          </w:p>
+        </w:tc>
+        <w:tc>
+          <w:tcPr>
+            <w:tcW w:w="4291" w:type="dxa"/>
+            <w:vAlign w:val="center"/>
+          </w:tcPr>
+          <w:p>
+            <w:pPr>
+              <w:tabs>
+                <w:tab w:val="left" w:pos="942"/>
+              </w:tabs>
+              <w:jc w:val="center"/>
+              <w:rPr>
+                <w:rFonts w:ascii="Times New Roman" w:hAnsi="Times New Roman" w:cs="Times New Roman"/>
+              </w:rPr>
+            </w:pPr>
+            <w:r>
+              <w:rPr>
+                <w:rFonts w:ascii="Times New Roman" w:hAnsi="Times New Roman" w:cs="Times New Roman"/>
+              </w:rPr>
+              <w:t>Keterangan</w:t>
             </w:r>
           </w:p>
         </w:tc>
@@ -2252,19 +2379,23 @@
               <w:spacing w:before="120" w:after="120"/>
               <w:rPr>
                 <w:rFonts w:ascii="Times New Roman" w:hAnsi="Times New Roman" w:cs="Times New Roman"/>
-              </w:rPr>
-            </w:pPr>
-            <w:r>
-              <w:rPr>
-                <w:rFonts w:ascii="Times New Roman" w:hAnsi="Times New Roman"/>
-              </w:rPr>
-              <w:t>1</w:t>
-            </w:r>
-          </w:p>
-        </w:tc>
-        <w:tc>
-          <w:tcPr>
-            <w:tcW w:w="8581" w:type="dxa"/>
+                <w:sz w:val="20"/>
+                <w:szCs w:val="20"/>
+              </w:rPr>
+            </w:pPr>
+            <w:r>
+              <w:rPr>
+                <w:rFonts w:ascii="Times New Roman" w:hAnsi="Times New Roman" w:cs="Times New Roman"/>
+                <w:sz w:val="20"/>
+                <w:szCs w:val="20"/>
+              </w:rPr>
+              <w:t>${lampiran_no}</w:t>
+            </w:r>
+          </w:p>
+        </w:tc>
+        <w:tc>
+          <w:tcPr>
+            <w:tcW w:w="4290" w:type="dxa"/>
           </w:tcPr>
           <w:p>
             <w:pPr>
@@ -2287,9 +2418,14 @@
                 <w:lang w:val="en-US"/>
                 <w14:ligatures w14:val="standardContextual"/>
               </w:rPr>
-              <w:t>-</w:t>
-            </w:r>
-          </w:p>
+              <w:t>${lampiran_gambar}</w:t>
+            </w:r>
+          </w:p>
+        </w:tc>
+        <w:tc>
+          <w:tcPr>
+            <w:tcW w:w="4291" w:type="dxa"/>
+          </w:tcPr>
           <w:p>
             <w:pPr>
               <w:tabs>
@@ -2301,6 +2437,12 @@
                 <w:rFonts w:ascii="Times New Roman" w:hAnsi="Times New Roman" w:cs="Times New Roman"/>
               </w:rPr>
             </w:pPr>
+            <w:r>
+              <w:rPr>
+                <w:rFonts w:ascii="Times New Roman" w:hAnsi="Times New Roman" w:cs="Times New Roman"/>
+              </w:rPr>
+              <w:t>${lampiran_ket}</w:t>
+            </w:r>
           </w:p>
         </w:tc>
       </w:tr>
@@ -4403,7 +4545,6 @@
   <w:style w:type="character" w:default="1" w:styleId="DefaultParagraphFont">
     <w:name w:val="Default Paragraph Font"/>
     <w:uiPriority w:val="1"/>
-    <w:semiHidden/>
     <w:unhideWhenUsed/>
   </w:style>
   <w:style w:type="table" w:default="1" w:styleId="TableNormal">

</xml_diff>

<commit_message>
update template default word
</commit_message>
<xml_diff>
--- a/storage/app/templates/laporan-harian/template-laporan-harian.docx
+++ b/storage/app/templates/laporan-harian/template-laporan-harian.docx
@@ -8,9 +8,11 @@
         <w:spacing w:line="360" w:lineRule="auto"/>
         <w:ind w:left="0"/>
       </w:pPr>
+      <w:proofErr w:type="spellStart"/>
       <w:r>
         <w:t>Pekerjaan</w:t>
       </w:r>
+      <w:proofErr w:type="spellEnd"/>
       <w:r>
         <w:tab/>
       </w:r>
@@ -22,7 +24,21 @@
         <w:rPr>
           <w:rFonts w:ascii="Times New Roman" w:hAnsi="Times New Roman" w:cs="Times New Roman"/>
         </w:rPr>
-        <w:t>${judul}</w:t>
+        <w:t>${</w:t>
+      </w:r>
+      <w:proofErr w:type="spellStart"/>
+      <w:r>
+        <w:rPr>
+          <w:rFonts w:ascii="Times New Roman" w:hAnsi="Times New Roman" w:cs="Times New Roman"/>
+        </w:rPr>
+        <w:t>judul</w:t>
+      </w:r>
+      <w:proofErr w:type="spellEnd"/>
+      <w:r>
+        <w:rPr>
+          <w:rFonts w:ascii="Times New Roman" w:hAnsi="Times New Roman" w:cs="Times New Roman"/>
+        </w:rPr>
+        <w:t>}</w:t>
       </w:r>
     </w:p>
     <w:p>
@@ -61,16 +77,40 @@
         <w:rPr>
           <w:rFonts w:ascii="Times New Roman" w:hAnsi="Times New Roman" w:cs="Times New Roman"/>
         </w:rPr>
-        <w:t>${lokasi}</w:t>
+        <w:t>${</w:t>
+      </w:r>
+      <w:proofErr w:type="spellStart"/>
+      <w:r>
+        <w:rPr>
+          <w:rFonts w:ascii="Times New Roman" w:hAnsi="Times New Roman" w:cs="Times New Roman"/>
+        </w:rPr>
+        <w:t>lokasi</w:t>
+      </w:r>
+      <w:proofErr w:type="spellEnd"/>
+      <w:r>
+        <w:rPr>
+          <w:rFonts w:ascii="Times New Roman" w:hAnsi="Times New Roman" w:cs="Times New Roman"/>
+        </w:rPr>
+        <w:t>}</w:t>
       </w:r>
     </w:p>
     <w:p>
       <w:pPr>
         <w:spacing w:line="360" w:lineRule="auto"/>
       </w:pPr>
+      <w:proofErr w:type="spellStart"/>
       <w:r>
-        <w:t>Pemberi Tugas</w:t>
+        <w:t>Pemberi</w:t>
       </w:r>
+      <w:proofErr w:type="spellEnd"/>
+      <w:r>
+        <w:t xml:space="preserve"> </w:t>
+      </w:r>
+      <w:proofErr w:type="spellStart"/>
+      <w:r>
+        <w:t>Tugas</w:t>
+      </w:r>
+      <w:proofErr w:type="spellEnd"/>
       <w:r>
         <w:tab/>
       </w:r>
@@ -84,6 +124,7 @@
         </w:rPr>
         <w:t>${</w:t>
       </w:r>
+      <w:proofErr w:type="spellStart"/>
       <w:r>
         <w:rPr>
           <w:rFonts w:ascii="Times New Roman" w:hAnsi="Times New Roman" w:cs="Times New Roman"/>
@@ -94,7 +135,14 @@
         <w:rPr>
           <w:rFonts w:ascii="Times New Roman" w:hAnsi="Times New Roman" w:cs="Times New Roman"/>
         </w:rPr>
-        <w:t>erusahaan}</w:t>
+        <w:t>erusahaan</w:t>
+      </w:r>
+      <w:proofErr w:type="spellEnd"/>
+      <w:r>
+        <w:rPr>
+          <w:rFonts w:ascii="Times New Roman" w:hAnsi="Times New Roman" w:cs="Times New Roman"/>
+        </w:rPr>
+        <w:t>}</w:t>
       </w:r>
     </w:p>
     <w:p>
@@ -104,18 +152,48 @@
           <w:rFonts w:cs="Times New Roman"/>
         </w:rPr>
       </w:pPr>
+      <w:proofErr w:type="spellStart"/>
       <w:r>
         <w:rPr>
           <w:rFonts w:cs="Times New Roman"/>
         </w:rPr>
-        <w:t>Konsultan Pengawas</w:t>
+        <w:t>Konsultan</w:t>
       </w:r>
+      <w:proofErr w:type="spellEnd"/>
       <w:r>
         <w:rPr>
           <w:rFonts w:cs="Times New Roman"/>
         </w:rPr>
+        <w:t xml:space="preserve"> </w:t>
+      </w:r>
+      <w:proofErr w:type="spellStart"/>
+      <w:r>
+        <w:rPr>
+          <w:rFonts w:cs="Times New Roman"/>
+        </w:rPr>
+        <w:t>Pengawas</w:t>
+      </w:r>
+      <w:proofErr w:type="spellEnd"/>
+      <w:r>
+        <w:rPr>
+          <w:rFonts w:cs="Times New Roman"/>
+        </w:rPr>
         <w:tab/>
-        <w:t>: PT Biro Klasifikasi Indonesia Persero / SBU Marine Service</w:t>
+        <w:t xml:space="preserve">: PT Biro </w:t>
+      </w:r>
+      <w:proofErr w:type="spellStart"/>
+      <w:r>
+        <w:rPr>
+          <w:rFonts w:cs="Times New Roman"/>
+        </w:rPr>
+        <w:t>Klasifikasi</w:t>
+      </w:r>
+      <w:proofErr w:type="spellEnd"/>
+      <w:r>
+        <w:rPr>
+          <w:rFonts w:cs="Times New Roman"/>
+        </w:rPr>
+        <w:t xml:space="preserve"> Indonesia Persero / SBU Marine Service</w:t>
       </w:r>
       <w:r>
         <w:rPr>
@@ -161,7 +239,21 @@
         <w:rPr>
           <w:rFonts w:ascii="Times New Roman" w:hAnsi="Times New Roman" w:cs="Times New Roman"/>
         </w:rPr>
-        <w:t>${no_kapal}</w:t>
+        <w:t>${</w:t>
+      </w:r>
+      <w:proofErr w:type="spellStart"/>
+      <w:r>
+        <w:rPr>
+          <w:rFonts w:ascii="Times New Roman" w:hAnsi="Times New Roman" w:cs="Times New Roman"/>
+        </w:rPr>
+        <w:t>no_kapal</w:t>
+      </w:r>
+      <w:proofErr w:type="spellEnd"/>
+      <w:r>
+        <w:rPr>
+          <w:rFonts w:ascii="Times New Roman" w:hAnsi="Times New Roman" w:cs="Times New Roman"/>
+        </w:rPr>
+        <w:t>}</w:t>
       </w:r>
     </w:p>
     <w:p>
@@ -181,6 +273,7 @@
           <w:szCs w:val="22"/>
         </w:rPr>
       </w:pPr>
+      <w:proofErr w:type="spellStart"/>
       <w:r>
         <w:rPr>
           <w:rFonts w:ascii="Times New Roman" w:hAnsi="Times New Roman" w:cs="Times New Roman"/>
@@ -188,8 +281,29 @@
           <w:sz w:val="22"/>
           <w:szCs w:val="22"/>
         </w:rPr>
-        <w:t>Kondisi Cuaca</w:t>
+        <w:t>Kondisi</w:t>
       </w:r>
+      <w:proofErr w:type="spellEnd"/>
+      <w:r>
+        <w:rPr>
+          <w:rFonts w:ascii="Times New Roman" w:hAnsi="Times New Roman" w:cs="Times New Roman"/>
+          <w:b/>
+          <w:sz w:val="22"/>
+          <w:szCs w:val="22"/>
+        </w:rPr>
+        <w:t xml:space="preserve"> </w:t>
+      </w:r>
+      <w:proofErr w:type="spellStart"/>
+      <w:r>
+        <w:rPr>
+          <w:rFonts w:ascii="Times New Roman" w:hAnsi="Times New Roman" w:cs="Times New Roman"/>
+          <w:b/>
+          <w:sz w:val="22"/>
+          <w:szCs w:val="22"/>
+        </w:rPr>
+        <w:t>Cuaca</w:t>
+      </w:r>
+      <w:proofErr w:type="spellEnd"/>
     </w:p>
     <w:tbl>
       <w:tblPr>
@@ -319,6 +433,7 @@
                 <w:color w:val="auto"/>
               </w:rPr>
             </w:pPr>
+            <w:proofErr w:type="spellStart"/>
             <w:r>
               <w:rPr>
                 <w:rFonts w:ascii="Times New Roman" w:hAnsi="Times New Roman" w:cs="Times New Roman"/>
@@ -326,6 +441,7 @@
               </w:rPr>
               <w:t>Cuaca</w:t>
             </w:r>
+            <w:proofErr w:type="spellEnd"/>
           </w:p>
         </w:tc>
         <w:tc>
@@ -348,7 +464,23 @@
                 <w:rFonts w:ascii="Times New Roman" w:hAnsi="Times New Roman" w:cs="Times New Roman"/>
                 <w:color w:val="auto"/>
               </w:rPr>
-              <w:t>${cuaca_pagi}</w:t>
+              <w:t>${</w:t>
+            </w:r>
+            <w:proofErr w:type="spellStart"/>
+            <w:r>
+              <w:rPr>
+                <w:rFonts w:ascii="Times New Roman" w:hAnsi="Times New Roman" w:cs="Times New Roman"/>
+                <w:color w:val="auto"/>
+              </w:rPr>
+              <w:t>cuaca_pagi</w:t>
+            </w:r>
+            <w:proofErr w:type="spellEnd"/>
+            <w:r>
+              <w:rPr>
+                <w:rFonts w:ascii="Times New Roman" w:hAnsi="Times New Roman" w:cs="Times New Roman"/>
+                <w:color w:val="auto"/>
+              </w:rPr>
+              <w:t>}</w:t>
             </w:r>
           </w:p>
         </w:tc>
@@ -372,15 +504,17 @@
                 <w:rFonts w:ascii="Times New Roman" w:hAnsi="Times New Roman" w:cs="Times New Roman"/>
                 <w:color w:val="auto"/>
               </w:rPr>
-              <w:t>${cuaca_</w:t>
-            </w:r>
-            <w:r>
-              <w:rPr>
-                <w:rFonts w:ascii="Times New Roman" w:hAnsi="Times New Roman" w:cs="Times New Roman"/>
-                <w:color w:val="auto"/>
-              </w:rPr>
-              <w:t>siang</w:t>
-            </w:r>
+              <w:t>${</w:t>
+            </w:r>
+            <w:proofErr w:type="spellStart"/>
+            <w:r>
+              <w:rPr>
+                <w:rFonts w:ascii="Times New Roman" w:hAnsi="Times New Roman" w:cs="Times New Roman"/>
+                <w:color w:val="auto"/>
+              </w:rPr>
+              <w:t>cuaca_siang</w:t>
+            </w:r>
+            <w:proofErr w:type="spellEnd"/>
             <w:r>
               <w:rPr>
                 <w:rFonts w:ascii="Times New Roman" w:hAnsi="Times New Roman" w:cs="Times New Roman"/>
@@ -410,15 +544,17 @@
                 <w:rFonts w:ascii="Times New Roman" w:hAnsi="Times New Roman" w:cs="Times New Roman"/>
                 <w:color w:val="auto"/>
               </w:rPr>
-              <w:t>${cuaca_</w:t>
-            </w:r>
-            <w:r>
-              <w:rPr>
-                <w:rFonts w:ascii="Times New Roman" w:hAnsi="Times New Roman" w:cs="Times New Roman"/>
-                <w:color w:val="auto"/>
-              </w:rPr>
-              <w:t>sore</w:t>
-            </w:r>
+              <w:t>${</w:t>
+            </w:r>
+            <w:proofErr w:type="spellStart"/>
+            <w:r>
+              <w:rPr>
+                <w:rFonts w:ascii="Times New Roman" w:hAnsi="Times New Roman" w:cs="Times New Roman"/>
+                <w:color w:val="auto"/>
+              </w:rPr>
+              <w:t>cuaca_sore</w:t>
+            </w:r>
+            <w:proofErr w:type="spellEnd"/>
             <w:r>
               <w:rPr>
                 <w:rFonts w:ascii="Times New Roman" w:hAnsi="Times New Roman" w:cs="Times New Roman"/>
@@ -443,6 +579,7 @@
                 <w:color w:val="auto"/>
               </w:rPr>
             </w:pPr>
+            <w:proofErr w:type="spellStart"/>
             <w:r>
               <w:rPr>
                 <w:rFonts w:ascii="Times New Roman" w:hAnsi="Times New Roman" w:cs="Times New Roman"/>
@@ -450,6 +587,7 @@
               </w:rPr>
               <w:t>Kelembaban</w:t>
             </w:r>
+            <w:proofErr w:type="spellEnd"/>
           </w:p>
         </w:tc>
         <w:tc>
@@ -472,7 +610,23 @@
                 <w:rFonts w:ascii="Times New Roman" w:hAnsi="Times New Roman" w:cs="Times New Roman"/>
                 <w:color w:val="auto"/>
               </w:rPr>
-              <w:t>${kelembaban_pagi}</w:t>
+              <w:t>${</w:t>
+            </w:r>
+            <w:proofErr w:type="spellStart"/>
+            <w:r>
+              <w:rPr>
+                <w:rFonts w:ascii="Times New Roman" w:hAnsi="Times New Roman" w:cs="Times New Roman"/>
+                <w:color w:val="auto"/>
+              </w:rPr>
+              <w:t>kelembaban_pagi</w:t>
+            </w:r>
+            <w:proofErr w:type="spellEnd"/>
+            <w:r>
+              <w:rPr>
+                <w:rFonts w:ascii="Times New Roman" w:hAnsi="Times New Roman" w:cs="Times New Roman"/>
+                <w:color w:val="auto"/>
+              </w:rPr>
+              <w:t>}</w:t>
             </w:r>
           </w:p>
         </w:tc>
@@ -496,15 +650,17 @@
                 <w:rFonts w:ascii="Times New Roman" w:hAnsi="Times New Roman" w:cs="Times New Roman"/>
                 <w:color w:val="auto"/>
               </w:rPr>
-              <w:t>${kelembaban_</w:t>
-            </w:r>
-            <w:r>
-              <w:rPr>
-                <w:rFonts w:ascii="Times New Roman" w:hAnsi="Times New Roman" w:cs="Times New Roman"/>
-                <w:color w:val="auto"/>
-              </w:rPr>
-              <w:t>siang</w:t>
-            </w:r>
+              <w:t>${</w:t>
+            </w:r>
+            <w:proofErr w:type="spellStart"/>
+            <w:r>
+              <w:rPr>
+                <w:rFonts w:ascii="Times New Roman" w:hAnsi="Times New Roman" w:cs="Times New Roman"/>
+                <w:color w:val="auto"/>
+              </w:rPr>
+              <w:t>kelembaban_siang</w:t>
+            </w:r>
+            <w:proofErr w:type="spellEnd"/>
             <w:r>
               <w:rPr>
                 <w:rFonts w:ascii="Times New Roman" w:hAnsi="Times New Roman" w:cs="Times New Roman"/>
@@ -532,15 +688,17 @@
                 <w:rFonts w:ascii="Times New Roman" w:hAnsi="Times New Roman" w:cs="Times New Roman"/>
                 <w:color w:val="auto"/>
               </w:rPr>
-              <w:t>${kelembaban_</w:t>
-            </w:r>
-            <w:r>
-              <w:rPr>
-                <w:rFonts w:ascii="Times New Roman" w:hAnsi="Times New Roman" w:cs="Times New Roman"/>
-                <w:color w:val="auto"/>
-              </w:rPr>
-              <w:t>sore</w:t>
-            </w:r>
+              <w:t>${</w:t>
+            </w:r>
+            <w:proofErr w:type="spellStart"/>
+            <w:r>
+              <w:rPr>
+                <w:rFonts w:ascii="Times New Roman" w:hAnsi="Times New Roman" w:cs="Times New Roman"/>
+                <w:color w:val="auto"/>
+              </w:rPr>
+              <w:t>kelembaban_sore</w:t>
+            </w:r>
+            <w:proofErr w:type="spellEnd"/>
             <w:r>
               <w:rPr>
                 <w:rFonts w:ascii="Times New Roman" w:hAnsi="Times New Roman" w:cs="Times New Roman"/>
@@ -571,13 +729,47 @@
               </w:rPr>
             </w:pPr>
             <w:bookmarkStart w:id="0" w:name="_Hlk196484723"/>
-            <w:r>
-              <w:rPr>
-                <w:rFonts w:ascii="Times New Roman" w:hAnsi="Times New Roman" w:cs="Times New Roman"/>
-                <w:color w:val="auto"/>
-              </w:rPr>
-              <w:t>Estimasi Suhu Lingkungan</w:t>
-            </w:r>
+            <w:proofErr w:type="spellStart"/>
+            <w:r>
+              <w:rPr>
+                <w:rFonts w:ascii="Times New Roman" w:hAnsi="Times New Roman" w:cs="Times New Roman"/>
+                <w:color w:val="auto"/>
+              </w:rPr>
+              <w:t>Estimasi</w:t>
+            </w:r>
+            <w:proofErr w:type="spellEnd"/>
+            <w:r>
+              <w:rPr>
+                <w:rFonts w:ascii="Times New Roman" w:hAnsi="Times New Roman" w:cs="Times New Roman"/>
+                <w:color w:val="auto"/>
+              </w:rPr>
+              <w:t xml:space="preserve"> </w:t>
+            </w:r>
+            <w:proofErr w:type="spellStart"/>
+            <w:r>
+              <w:rPr>
+                <w:rFonts w:ascii="Times New Roman" w:hAnsi="Times New Roman" w:cs="Times New Roman"/>
+                <w:color w:val="auto"/>
+              </w:rPr>
+              <w:t>Suhu</w:t>
+            </w:r>
+            <w:proofErr w:type="spellEnd"/>
+            <w:r>
+              <w:rPr>
+                <w:rFonts w:ascii="Times New Roman" w:hAnsi="Times New Roman" w:cs="Times New Roman"/>
+                <w:color w:val="auto"/>
+              </w:rPr>
+              <w:t xml:space="preserve"> </w:t>
+            </w:r>
+            <w:proofErr w:type="spellStart"/>
+            <w:r>
+              <w:rPr>
+                <w:rFonts w:ascii="Times New Roman" w:hAnsi="Times New Roman" w:cs="Times New Roman"/>
+                <w:color w:val="auto"/>
+              </w:rPr>
+              <w:t>Lingkungan</w:t>
+            </w:r>
+            <w:proofErr w:type="spellEnd"/>
           </w:p>
         </w:tc>
         <w:tc>
@@ -597,7 +789,23 @@
                 <w:rFonts w:ascii="Times New Roman" w:hAnsi="Times New Roman" w:cs="Times New Roman"/>
                 <w:color w:val="auto"/>
               </w:rPr>
-              <w:t>${suhu}</w:t>
+              <w:t>${</w:t>
+            </w:r>
+            <w:proofErr w:type="spellStart"/>
+            <w:r>
+              <w:rPr>
+                <w:rFonts w:ascii="Times New Roman" w:hAnsi="Times New Roman" w:cs="Times New Roman"/>
+                <w:color w:val="auto"/>
+              </w:rPr>
+              <w:t>suhu</w:t>
+            </w:r>
+            <w:proofErr w:type="spellEnd"/>
+            <w:r>
+              <w:rPr>
+                <w:rFonts w:ascii="Times New Roman" w:hAnsi="Times New Roman" w:cs="Times New Roman"/>
+                <w:color w:val="auto"/>
+              </w:rPr>
+              <w:t>}</w:t>
             </w:r>
           </w:p>
         </w:tc>
@@ -634,6 +842,7 @@
           <w:b/>
         </w:rPr>
       </w:pPr>
+      <w:proofErr w:type="spellStart"/>
       <w:r>
         <w:rPr>
           <w:rFonts w:ascii="Times New Roman" w:hAnsi="Times New Roman" w:cs="Times New Roman"/>
@@ -641,6 +850,7 @@
         </w:rPr>
         <w:t>Personel</w:t>
       </w:r>
+      <w:proofErr w:type="spellEnd"/>
       <w:r>
         <w:rPr>
           <w:rFonts w:ascii="Times New Roman" w:hAnsi="Times New Roman" w:cs="Times New Roman"/>
@@ -719,6 +929,7 @@
                 <w:color w:val="auto"/>
               </w:rPr>
             </w:pPr>
+            <w:proofErr w:type="spellStart"/>
             <w:r>
               <w:rPr>
                 <w:rFonts w:ascii="Times New Roman" w:hAnsi="Times New Roman" w:cs="Times New Roman"/>
@@ -726,6 +937,7 @@
               </w:rPr>
               <w:t>Jabatan</w:t>
             </w:r>
+            <w:proofErr w:type="spellEnd"/>
           </w:p>
         </w:tc>
         <w:tc>
@@ -773,6 +985,7 @@
                 <w:color w:val="auto"/>
               </w:rPr>
             </w:pPr>
+            <w:proofErr w:type="spellStart"/>
             <w:r>
               <w:rPr>
                 <w:rFonts w:ascii="Times New Roman" w:hAnsi="Times New Roman" w:cs="Times New Roman"/>
@@ -780,6 +993,7 @@
               </w:rPr>
               <w:t>Keterangan</w:t>
             </w:r>
+            <w:proofErr w:type="spellEnd"/>
           </w:p>
         </w:tc>
       </w:tr>
@@ -812,6 +1026,7 @@
               </w:rPr>
               <w:t>${</w:t>
             </w:r>
+            <w:proofErr w:type="spellStart"/>
             <w:r>
               <w:rPr>
                 <w:rFonts w:ascii="Times New Roman" w:hAnsi="Times New Roman" w:cs="Times New Roman"/>
@@ -821,6 +1036,7 @@
               </w:rPr>
               <w:t>personel_no</w:t>
             </w:r>
+            <w:proofErr w:type="spellEnd"/>
             <w:r>
               <w:rPr>
                 <w:rFonts w:ascii="Times New Roman" w:hAnsi="Times New Roman" w:cs="Times New Roman"/>
@@ -850,15 +1066,17 @@
                 <w:rFonts w:ascii="Times New Roman" w:hAnsi="Times New Roman" w:cs="Times New Roman"/>
                 <w:color w:val="auto"/>
               </w:rPr>
-              <w:t>${personel_</w:t>
-            </w:r>
-            <w:r>
-              <w:rPr>
-                <w:rFonts w:ascii="Times New Roman" w:hAnsi="Times New Roman" w:cs="Times New Roman"/>
-                <w:color w:val="auto"/>
-              </w:rPr>
-              <w:t>jabatan</w:t>
-            </w:r>
+              <w:t>${</w:t>
+            </w:r>
+            <w:proofErr w:type="spellStart"/>
+            <w:r>
+              <w:rPr>
+                <w:rFonts w:ascii="Times New Roman" w:hAnsi="Times New Roman" w:cs="Times New Roman"/>
+                <w:color w:val="auto"/>
+              </w:rPr>
+              <w:t>personel_jabatan</w:t>
+            </w:r>
+            <w:proofErr w:type="spellEnd"/>
             <w:r>
               <w:rPr>
                 <w:rFonts w:ascii="Times New Roman" w:hAnsi="Times New Roman" w:cs="Times New Roman"/>
@@ -886,15 +1104,17 @@
                 <w:rFonts w:ascii="Times New Roman" w:hAnsi="Times New Roman" w:cs="Times New Roman"/>
                 <w:color w:val="auto"/>
               </w:rPr>
-              <w:t>${personel_</w:t>
-            </w:r>
-            <w:r>
-              <w:rPr>
-                <w:rFonts w:ascii="Times New Roman" w:hAnsi="Times New Roman" w:cs="Times New Roman"/>
-                <w:color w:val="auto"/>
-              </w:rPr>
-              <w:t>status</w:t>
-            </w:r>
+              <w:t>${</w:t>
+            </w:r>
+            <w:proofErr w:type="spellStart"/>
+            <w:r>
+              <w:rPr>
+                <w:rFonts w:ascii="Times New Roman" w:hAnsi="Times New Roman" w:cs="Times New Roman"/>
+                <w:color w:val="auto"/>
+              </w:rPr>
+              <w:t>personel_status</w:t>
+            </w:r>
+            <w:proofErr w:type="spellEnd"/>
             <w:r>
               <w:rPr>
                 <w:rFonts w:ascii="Times New Roman" w:hAnsi="Times New Roman" w:cs="Times New Roman"/>
@@ -922,15 +1142,17 @@
                 <w:rFonts w:ascii="Times New Roman" w:hAnsi="Times New Roman" w:cs="Times New Roman"/>
                 <w:color w:val="auto"/>
               </w:rPr>
-              <w:t>${personel_</w:t>
-            </w:r>
-            <w:r>
-              <w:rPr>
-                <w:rFonts w:ascii="Times New Roman" w:hAnsi="Times New Roman" w:cs="Times New Roman"/>
-                <w:color w:val="auto"/>
-              </w:rPr>
-              <w:t>keterangan</w:t>
-            </w:r>
+              <w:t>${</w:t>
+            </w:r>
+            <w:proofErr w:type="spellStart"/>
+            <w:r>
+              <w:rPr>
+                <w:rFonts w:ascii="Times New Roman" w:hAnsi="Times New Roman" w:cs="Times New Roman"/>
+                <w:color w:val="auto"/>
+              </w:rPr>
+              <w:t>personel_keterangan</w:t>
+            </w:r>
+            <w:proofErr w:type="spellEnd"/>
             <w:r>
               <w:rPr>
                 <w:rFonts w:ascii="Times New Roman" w:hAnsi="Times New Roman" w:cs="Times New Roman"/>
@@ -967,6 +1189,7 @@
           <w:b/>
         </w:rPr>
       </w:pPr>
+      <w:proofErr w:type="spellStart"/>
       <w:r>
         <w:rPr>
           <w:rFonts w:ascii="Times New Roman" w:hAnsi="Times New Roman"/>
@@ -974,6 +1197,7 @@
         </w:rPr>
         <w:t>Peralatan</w:t>
       </w:r>
+      <w:proofErr w:type="spellEnd"/>
     </w:p>
     <w:tbl>
       <w:tblPr>
@@ -990,10 +1214,10 @@
         <w:tblLook w:val="04A0" w:firstRow="1" w:lastRow="0" w:firstColumn="1" w:lastColumn="0" w:noHBand="0" w:noVBand="1"/>
       </w:tblPr>
       <w:tblGrid>
-        <w:gridCol w:w="905"/>
-        <w:gridCol w:w="2405"/>
-        <w:gridCol w:w="1993"/>
-        <w:gridCol w:w="3713"/>
+        <w:gridCol w:w="1674"/>
+        <w:gridCol w:w="1984"/>
+        <w:gridCol w:w="2065"/>
+        <w:gridCol w:w="3293"/>
       </w:tblGrid>
       <w:tr>
         <w:trPr>
@@ -1064,12 +1288,14 @@
                 <w:rFonts w:ascii="Times New Roman" w:hAnsi="Times New Roman"/>
               </w:rPr>
             </w:pPr>
+            <w:proofErr w:type="spellStart"/>
             <w:r>
               <w:rPr>
                 <w:rFonts w:ascii="Times New Roman" w:hAnsi="Times New Roman"/>
               </w:rPr>
               <w:t>Jumlah</w:t>
             </w:r>
+            <w:proofErr w:type="spellEnd"/>
           </w:p>
         </w:tc>
         <w:tc>
@@ -1089,12 +1315,14 @@
                 <w:rFonts w:ascii="Times New Roman" w:hAnsi="Times New Roman"/>
               </w:rPr>
             </w:pPr>
+            <w:proofErr w:type="spellStart"/>
             <w:r>
               <w:rPr>
                 <w:rFonts w:ascii="Times New Roman" w:hAnsi="Times New Roman"/>
               </w:rPr>
               <w:t>Keterangan</w:t>
             </w:r>
+            <w:proofErr w:type="spellEnd"/>
           </w:p>
         </w:tc>
       </w:tr>
@@ -1122,7 +1350,25 @@
                 <w:b w:val="0"/>
                 <w:bCs w:val="0"/>
               </w:rPr>
-              <w:t>1</w:t>
+              <w:t>${</w:t>
+            </w:r>
+            <w:proofErr w:type="spellStart"/>
+            <w:r>
+              <w:rPr>
+                <w:rFonts w:ascii="Times New Roman" w:hAnsi="Times New Roman"/>
+                <w:b w:val="0"/>
+                <w:bCs w:val="0"/>
+              </w:rPr>
+              <w:t>peralatan_no</w:t>
+            </w:r>
+            <w:proofErr w:type="spellEnd"/>
+            <w:r>
+              <w:rPr>
+                <w:rFonts w:ascii="Times New Roman" w:hAnsi="Times New Roman"/>
+                <w:b w:val="0"/>
+                <w:bCs w:val="0"/>
+              </w:rPr>
+              <w:t>}</w:t>
             </w:r>
           </w:p>
         </w:tc>
@@ -1142,7 +1388,27 @@
               <w:rPr>
                 <w:rFonts w:ascii="Times New Roman" w:hAnsi="Times New Roman"/>
               </w:rPr>
-              <w:t>-</w:t>
+              <w:t>${</w:t>
+            </w:r>
+            <w:proofErr w:type="spellStart"/>
+            <w:r>
+              <w:rPr>
+                <w:rFonts w:ascii="Times New Roman" w:hAnsi="Times New Roman"/>
+              </w:rPr>
+              <w:t>peralatan_</w:t>
+            </w:r>
+            <w:r>
+              <w:rPr>
+                <w:rFonts w:ascii="Times New Roman" w:hAnsi="Times New Roman"/>
+              </w:rPr>
+              <w:t>jenis</w:t>
+            </w:r>
+            <w:proofErr w:type="spellEnd"/>
+            <w:r>
+              <w:rPr>
+                <w:rFonts w:ascii="Times New Roman" w:hAnsi="Times New Roman"/>
+              </w:rPr>
+              <w:t>}</w:t>
             </w:r>
           </w:p>
         </w:tc>
@@ -1162,7 +1428,27 @@
               <w:rPr>
                 <w:rFonts w:ascii="Times New Roman" w:hAnsi="Times New Roman"/>
               </w:rPr>
-              <w:t>-</w:t>
+              <w:t>${</w:t>
+            </w:r>
+            <w:proofErr w:type="spellStart"/>
+            <w:r>
+              <w:rPr>
+                <w:rFonts w:ascii="Times New Roman" w:hAnsi="Times New Roman"/>
+              </w:rPr>
+              <w:t>peralatan_</w:t>
+            </w:r>
+            <w:r>
+              <w:rPr>
+                <w:rFonts w:ascii="Times New Roman" w:hAnsi="Times New Roman"/>
+              </w:rPr>
+              <w:t>jumlah</w:t>
+            </w:r>
+            <w:proofErr w:type="spellEnd"/>
+            <w:r>
+              <w:rPr>
+                <w:rFonts w:ascii="Times New Roman" w:hAnsi="Times New Roman"/>
+              </w:rPr>
+              <w:t>}</w:t>
             </w:r>
           </w:p>
         </w:tc>
@@ -1182,7 +1468,27 @@
               <w:rPr>
                 <w:rFonts w:ascii="Times New Roman" w:hAnsi="Times New Roman"/>
               </w:rPr>
-              <w:t>-</w:t>
+              <w:t>${</w:t>
+            </w:r>
+            <w:proofErr w:type="spellStart"/>
+            <w:r>
+              <w:rPr>
+                <w:rFonts w:ascii="Times New Roman" w:hAnsi="Times New Roman"/>
+              </w:rPr>
+              <w:t>peralatan_</w:t>
+            </w:r>
+            <w:r>
+              <w:rPr>
+                <w:rFonts w:ascii="Times New Roman" w:hAnsi="Times New Roman"/>
+              </w:rPr>
+              <w:t>keterangan</w:t>
+            </w:r>
+            <w:proofErr w:type="spellEnd"/>
+            <w:r>
+              <w:rPr>
+                <w:rFonts w:ascii="Times New Roman" w:hAnsi="Times New Roman"/>
+              </w:rPr>
+              <w:t>}</w:t>
             </w:r>
           </w:p>
         </w:tc>
@@ -1235,10 +1541,10 @@
         <w:tblLook w:val="04A0" w:firstRow="1" w:lastRow="0" w:firstColumn="1" w:lastColumn="0" w:noHBand="0" w:noVBand="1"/>
       </w:tblPr>
       <w:tblGrid>
-        <w:gridCol w:w="978"/>
-        <w:gridCol w:w="2348"/>
-        <w:gridCol w:w="2002"/>
-        <w:gridCol w:w="3688"/>
+        <w:gridCol w:w="1918"/>
+        <w:gridCol w:w="2114"/>
+        <w:gridCol w:w="2310"/>
+        <w:gridCol w:w="2674"/>
       </w:tblGrid>
       <w:tr>
         <w:trPr>
@@ -1248,11 +1554,6 @@
           <w:tcPr>
             <w:cnfStyle w:val="001000000000" w:firstRow="0" w:lastRow="0" w:firstColumn="1" w:lastColumn="0" w:oddVBand="0" w:evenVBand="0" w:oddHBand="0" w:evenHBand="0" w:firstRowFirstColumn="0" w:firstRowLastColumn="0" w:lastRowFirstColumn="0" w:lastRowLastColumn="0"/>
             <w:tcW w:w="542" w:type="pct"/>
-            <w:tcBorders>
-              <w:top w:val="none" w:sz="0" w:space="0" w:color="auto"/>
-              <w:left w:val="none" w:sz="0" w:space="0" w:color="auto"/>
-              <w:bottom w:val="none" w:sz="0" w:space="0" w:color="auto"/>
-            </w:tcBorders>
           </w:tcPr>
           <w:p>
             <w:pPr>
@@ -1274,10 +1575,6 @@
         <w:tc>
           <w:tcPr>
             <w:tcW w:w="1302" w:type="pct"/>
-            <w:tcBorders>
-              <w:top w:val="none" w:sz="0" w:space="0" w:color="auto"/>
-              <w:bottom w:val="none" w:sz="0" w:space="0" w:color="auto"/>
-            </w:tcBorders>
           </w:tcPr>
           <w:p>
             <w:pPr>
@@ -1300,10 +1597,6 @@
         <w:tc>
           <w:tcPr>
             <w:tcW w:w="1110" w:type="pct"/>
-            <w:tcBorders>
-              <w:top w:val="none" w:sz="0" w:space="0" w:color="auto"/>
-              <w:bottom w:val="none" w:sz="0" w:space="0" w:color="auto"/>
-            </w:tcBorders>
           </w:tcPr>
           <w:p>
             <w:pPr>
@@ -1315,22 +1608,19 @@
                 <w:bCs w:val="0"/>
               </w:rPr>
             </w:pPr>
+            <w:proofErr w:type="spellStart"/>
             <w:r>
               <w:rPr>
                 <w:rFonts w:ascii="Times New Roman" w:hAnsi="Times New Roman"/>
               </w:rPr>
               <w:t>Jumlah</w:t>
             </w:r>
+            <w:proofErr w:type="spellEnd"/>
           </w:p>
         </w:tc>
         <w:tc>
           <w:tcPr>
             <w:tcW w:w="2045" w:type="pct"/>
-            <w:tcBorders>
-              <w:top w:val="none" w:sz="0" w:space="0" w:color="auto"/>
-              <w:bottom w:val="none" w:sz="0" w:space="0" w:color="auto"/>
-              <w:right w:val="none" w:sz="0" w:space="0" w:color="auto"/>
-            </w:tcBorders>
           </w:tcPr>
           <w:p>
             <w:pPr>
@@ -1342,12 +1632,14 @@
                 <w:bCs w:val="0"/>
               </w:rPr>
             </w:pPr>
+            <w:proofErr w:type="spellStart"/>
             <w:r>
               <w:rPr>
                 <w:rFonts w:ascii="Times New Roman" w:hAnsi="Times New Roman"/>
               </w:rPr>
               <w:t>Keterangan</w:t>
             </w:r>
+            <w:proofErr w:type="spellEnd"/>
           </w:p>
         </w:tc>
       </w:tr>
@@ -1375,7 +1667,25 @@
                 <w:b w:val="0"/>
                 <w:bCs w:val="0"/>
               </w:rPr>
-              <w:t>1</w:t>
+              <w:t>${</w:t>
+            </w:r>
+            <w:proofErr w:type="spellStart"/>
+            <w:r>
+              <w:rPr>
+                <w:rFonts w:ascii="Times New Roman" w:hAnsi="Times New Roman"/>
+                <w:b w:val="0"/>
+                <w:bCs w:val="0"/>
+              </w:rPr>
+              <w:t>consumable_no</w:t>
+            </w:r>
+            <w:proofErr w:type="spellEnd"/>
+            <w:r>
+              <w:rPr>
+                <w:rFonts w:ascii="Times New Roman" w:hAnsi="Times New Roman"/>
+                <w:b w:val="0"/>
+                <w:bCs w:val="0"/>
+              </w:rPr>
+              <w:t>}</w:t>
             </w:r>
           </w:p>
         </w:tc>
@@ -1395,7 +1705,27 @@
               <w:rPr>
                 <w:rFonts w:ascii="Times New Roman" w:hAnsi="Times New Roman"/>
               </w:rPr>
-              <w:t>-</w:t>
+              <w:t>${</w:t>
+            </w:r>
+            <w:proofErr w:type="spellStart"/>
+            <w:r>
+              <w:rPr>
+                <w:rFonts w:ascii="Times New Roman" w:hAnsi="Times New Roman"/>
+              </w:rPr>
+              <w:t>consumable_</w:t>
+            </w:r>
+            <w:r>
+              <w:rPr>
+                <w:rFonts w:ascii="Times New Roman" w:hAnsi="Times New Roman"/>
+              </w:rPr>
+              <w:t>jenis</w:t>
+            </w:r>
+            <w:proofErr w:type="spellEnd"/>
+            <w:r>
+              <w:rPr>
+                <w:rFonts w:ascii="Times New Roman" w:hAnsi="Times New Roman"/>
+              </w:rPr>
+              <w:t>}</w:t>
             </w:r>
           </w:p>
         </w:tc>
@@ -1415,7 +1745,27 @@
               <w:rPr>
                 <w:rFonts w:ascii="Times New Roman" w:hAnsi="Times New Roman"/>
               </w:rPr>
-              <w:t>-</w:t>
+              <w:t>${</w:t>
+            </w:r>
+            <w:proofErr w:type="spellStart"/>
+            <w:r>
+              <w:rPr>
+                <w:rFonts w:ascii="Times New Roman" w:hAnsi="Times New Roman"/>
+              </w:rPr>
+              <w:t>consumable_</w:t>
+            </w:r>
+            <w:r>
+              <w:rPr>
+                <w:rFonts w:ascii="Times New Roman" w:hAnsi="Times New Roman"/>
+              </w:rPr>
+              <w:t>jumlah</w:t>
+            </w:r>
+            <w:proofErr w:type="spellEnd"/>
+            <w:r>
+              <w:rPr>
+                <w:rFonts w:ascii="Times New Roman" w:hAnsi="Times New Roman"/>
+              </w:rPr>
+              <w:t>}</w:t>
             </w:r>
           </w:p>
         </w:tc>
@@ -1435,7 +1785,27 @@
               <w:rPr>
                 <w:rFonts w:ascii="Times New Roman" w:hAnsi="Times New Roman"/>
               </w:rPr>
-              <w:t>-</w:t>
+              <w:t>${</w:t>
+            </w:r>
+            <w:proofErr w:type="spellStart"/>
+            <w:r>
+              <w:rPr>
+                <w:rFonts w:ascii="Times New Roman" w:hAnsi="Times New Roman"/>
+              </w:rPr>
+              <w:t>consumable_</w:t>
+            </w:r>
+            <w:r>
+              <w:rPr>
+                <w:rFonts w:ascii="Times New Roman" w:hAnsi="Times New Roman"/>
+              </w:rPr>
+              <w:t>keterangan</w:t>
+            </w:r>
+            <w:proofErr w:type="spellEnd"/>
+            <w:r>
+              <w:rPr>
+                <w:rFonts w:ascii="Times New Roman" w:hAnsi="Times New Roman"/>
+              </w:rPr>
+              <w:t>}</w:t>
             </w:r>
           </w:p>
         </w:tc>
@@ -1465,13 +1835,31 @@
           <w:b/>
         </w:rPr>
       </w:pPr>
+      <w:proofErr w:type="spellStart"/>
       <w:r>
         <w:rPr>
           <w:rFonts w:ascii="Times New Roman" w:hAnsi="Times New Roman"/>
           <w:b/>
         </w:rPr>
-        <w:t>Uraian Aktivitas</w:t>
+        <w:t>Uraian</w:t>
       </w:r>
+      <w:proofErr w:type="spellEnd"/>
+      <w:r>
+        <w:rPr>
+          <w:rFonts w:ascii="Times New Roman" w:hAnsi="Times New Roman"/>
+          <w:b/>
+        </w:rPr>
+        <w:t xml:space="preserve"> </w:t>
+      </w:r>
+      <w:proofErr w:type="spellStart"/>
+      <w:r>
+        <w:rPr>
+          <w:rFonts w:ascii="Times New Roman" w:hAnsi="Times New Roman"/>
+          <w:b/>
+        </w:rPr>
+        <w:t>Aktivitas</w:t>
+      </w:r>
+      <w:proofErr w:type="spellEnd"/>
     </w:p>
     <w:p>
       <w:pPr>
@@ -1510,9 +1898,9 @@
         <w:tblLook w:val="04A0" w:firstRow="1" w:lastRow="0" w:firstColumn="1" w:lastColumn="0" w:noHBand="0" w:noVBand="1"/>
       </w:tblPr>
       <w:tblGrid>
-        <w:gridCol w:w="878"/>
-        <w:gridCol w:w="6353"/>
-        <w:gridCol w:w="1785"/>
+        <w:gridCol w:w="1613"/>
+        <w:gridCol w:w="5741"/>
+        <w:gridCol w:w="1662"/>
       </w:tblGrid>
       <w:tr>
         <w:trPr>
@@ -1566,12 +1954,14 @@
                 <w:bCs w:val="0"/>
               </w:rPr>
             </w:pPr>
+            <w:proofErr w:type="spellStart"/>
             <w:r>
               <w:rPr>
                 <w:rFonts w:ascii="Times New Roman" w:hAnsi="Times New Roman"/>
               </w:rPr>
               <w:t>Aktifitas</w:t>
             </w:r>
+            <w:proofErr w:type="spellEnd"/>
           </w:p>
         </w:tc>
         <w:tc>
@@ -1619,13 +2009,35 @@
               <w:jc w:val="center"/>
               <w:rPr>
                 <w:rFonts w:ascii="Times New Roman" w:hAnsi="Times New Roman"/>
-              </w:rPr>
-            </w:pPr>
-            <w:r>
-              <w:rPr>
-                <w:rFonts w:ascii="Times New Roman" w:hAnsi="Times New Roman"/>
-              </w:rPr>
-              <w:t>1</w:t>
+                <w:b w:val="0"/>
+                <w:bCs w:val="0"/>
+              </w:rPr>
+            </w:pPr>
+            <w:r>
+              <w:rPr>
+                <w:rFonts w:ascii="Times New Roman" w:hAnsi="Times New Roman"/>
+                <w:b w:val="0"/>
+                <w:bCs w:val="0"/>
+              </w:rPr>
+              <w:t>${</w:t>
+            </w:r>
+            <w:proofErr w:type="spellStart"/>
+            <w:r>
+              <w:rPr>
+                <w:rFonts w:ascii="Times New Roman" w:hAnsi="Times New Roman"/>
+                <w:b w:val="0"/>
+                <w:bCs w:val="0"/>
+              </w:rPr>
+              <w:t>aktivitas_no</w:t>
+            </w:r>
+            <w:proofErr w:type="spellEnd"/>
+            <w:r>
+              <w:rPr>
+                <w:rFonts w:ascii="Times New Roman" w:hAnsi="Times New Roman"/>
+                <w:b w:val="0"/>
+                <w:bCs w:val="0"/>
+              </w:rPr>
+              <w:t>}</w:t>
             </w:r>
           </w:p>
         </w:tc>
@@ -1645,7 +2057,27 @@
               <w:rPr>
                 <w:rFonts w:ascii="Times New Roman" w:hAnsi="Times New Roman"/>
               </w:rPr>
-              <w:t>-</w:t>
+              <w:t>${</w:t>
+            </w:r>
+            <w:proofErr w:type="spellStart"/>
+            <w:r>
+              <w:rPr>
+                <w:rFonts w:ascii="Times New Roman" w:hAnsi="Times New Roman"/>
+              </w:rPr>
+              <w:t>aktivitas_</w:t>
+            </w:r>
+            <w:r>
+              <w:rPr>
+                <w:rFonts w:ascii="Times New Roman" w:hAnsi="Times New Roman"/>
+              </w:rPr>
+              <w:t>aktivitas</w:t>
+            </w:r>
+            <w:proofErr w:type="spellEnd"/>
+            <w:r>
+              <w:rPr>
+                <w:rFonts w:ascii="Times New Roman" w:hAnsi="Times New Roman"/>
+              </w:rPr>
+              <w:t>}</w:t>
             </w:r>
           </w:p>
         </w:tc>
@@ -1666,7 +2098,27 @@
               <w:rPr>
                 <w:rFonts w:ascii="Times New Roman" w:hAnsi="Times New Roman"/>
               </w:rPr>
-              <w:t>-</w:t>
+              <w:t>${</w:t>
+            </w:r>
+            <w:proofErr w:type="spellStart"/>
+            <w:r>
+              <w:rPr>
+                <w:rFonts w:ascii="Times New Roman" w:hAnsi="Times New Roman"/>
+              </w:rPr>
+              <w:t>aktivitas_</w:t>
+            </w:r>
+            <w:r>
+              <w:rPr>
+                <w:rFonts w:ascii="Times New Roman" w:hAnsi="Times New Roman"/>
+              </w:rPr>
+              <w:t>pic</w:t>
+            </w:r>
+            <w:proofErr w:type="spellEnd"/>
+            <w:r>
+              <w:rPr>
+                <w:rFonts w:ascii="Times New Roman" w:hAnsi="Times New Roman"/>
+              </w:rPr>
+              <w:t>}</w:t>
             </w:r>
           </w:p>
         </w:tc>
@@ -1762,7 +2214,25 @@
                 <w:sz w:val="22"/>
                 <w:szCs w:val="22"/>
               </w:rPr>
-              <w:t>${tanggal}</w:t>
+              <w:t>${</w:t>
+            </w:r>
+            <w:proofErr w:type="spellStart"/>
+            <w:r>
+              <w:rPr>
+                <w:rFonts w:ascii="Times New Roman" w:hAnsi="Times New Roman"/>
+                <w:sz w:val="22"/>
+                <w:szCs w:val="22"/>
+              </w:rPr>
+              <w:t>tanggal</w:t>
+            </w:r>
+            <w:proofErr w:type="spellEnd"/>
+            <w:r>
+              <w:rPr>
+                <w:rFonts w:ascii="Times New Roman" w:hAnsi="Times New Roman"/>
+                <w:sz w:val="22"/>
+                <w:szCs w:val="22"/>
+              </w:rPr>
+              <w:t>}</w:t>
             </w:r>
           </w:p>
         </w:tc>
@@ -1820,14 +2290,34 @@
                 <w:bCs w:val="0"/>
               </w:rPr>
             </w:pPr>
+            <w:proofErr w:type="spellStart"/>
             <w:r>
               <w:rPr>
                 <w:rFonts w:ascii="Times New Roman" w:hAnsi="Times New Roman"/>
                 <w:sz w:val="22"/>
                 <w:szCs w:val="22"/>
               </w:rPr>
-              <w:t>Konsultan Pengawas</w:t>
-            </w:r>
+              <w:t>Konsultan</w:t>
+            </w:r>
+            <w:proofErr w:type="spellEnd"/>
+            <w:r>
+              <w:rPr>
+                <w:rFonts w:ascii="Times New Roman" w:hAnsi="Times New Roman"/>
+                <w:sz w:val="22"/>
+                <w:szCs w:val="22"/>
+              </w:rPr>
+              <w:t xml:space="preserve"> </w:t>
+            </w:r>
+            <w:proofErr w:type="spellStart"/>
+            <w:r>
+              <w:rPr>
+                <w:rFonts w:ascii="Times New Roman" w:hAnsi="Times New Roman"/>
+                <w:sz w:val="22"/>
+                <w:szCs w:val="22"/>
+              </w:rPr>
+              <w:t>Pengawas</w:t>
+            </w:r>
+            <w:proofErr w:type="spellEnd"/>
           </w:p>
         </w:tc>
         <w:tc>
@@ -2264,8 +2754,36 @@
           <w:b/>
           <w:bCs/>
         </w:rPr>
-        <w:t>Lampiran 1 : Dokumentasi</w:t>
+        <w:t xml:space="preserve">Lampiran </w:t>
       </w:r>
+      <w:proofErr w:type="gramStart"/>
+      <w:r>
+        <w:rPr>
+          <w:rFonts w:ascii="Times New Roman" w:hAnsi="Times New Roman"/>
+          <w:b/>
+          <w:bCs/>
+        </w:rPr>
+        <w:t>1 :</w:t>
+      </w:r>
+      <w:proofErr w:type="gramEnd"/>
+      <w:r>
+        <w:rPr>
+          <w:rFonts w:ascii="Times New Roman" w:hAnsi="Times New Roman"/>
+          <w:b/>
+          <w:bCs/>
+        </w:rPr>
+        <w:t xml:space="preserve"> </w:t>
+      </w:r>
+      <w:proofErr w:type="spellStart"/>
+      <w:r>
+        <w:rPr>
+          <w:rFonts w:ascii="Times New Roman" w:hAnsi="Times New Roman"/>
+          <w:b/>
+          <w:bCs/>
+        </w:rPr>
+        <w:t>Dokumentasi</w:t>
+      </w:r>
+      <w:proofErr w:type="spellEnd"/>
     </w:p>
     <w:p>
       <w:pPr>
@@ -2353,12 +2871,14 @@
                 <w:rFonts w:ascii="Times New Roman" w:hAnsi="Times New Roman" w:cs="Times New Roman"/>
               </w:rPr>
             </w:pPr>
+            <w:proofErr w:type="spellStart"/>
             <w:r>
               <w:rPr>
                 <w:rFonts w:ascii="Times New Roman" w:hAnsi="Times New Roman" w:cs="Times New Roman"/>
               </w:rPr>
               <w:t>Keterangan</w:t>
             </w:r>
+            <w:proofErr w:type="spellEnd"/>
           </w:p>
         </w:tc>
       </w:tr>
@@ -2389,7 +2909,25 @@
                 <w:sz w:val="20"/>
                 <w:szCs w:val="20"/>
               </w:rPr>
-              <w:t>${lampiran_no}</w:t>
+              <w:t>${</w:t>
+            </w:r>
+            <w:proofErr w:type="spellStart"/>
+            <w:r>
+              <w:rPr>
+                <w:rFonts w:ascii="Times New Roman" w:hAnsi="Times New Roman" w:cs="Times New Roman"/>
+                <w:sz w:val="20"/>
+                <w:szCs w:val="20"/>
+              </w:rPr>
+              <w:t>lampiran_no</w:t>
+            </w:r>
+            <w:proofErr w:type="spellEnd"/>
+            <w:r>
+              <w:rPr>
+                <w:rFonts w:ascii="Times New Roman" w:hAnsi="Times New Roman" w:cs="Times New Roman"/>
+                <w:sz w:val="20"/>
+                <w:szCs w:val="20"/>
+              </w:rPr>
+              <w:t>}</w:t>
             </w:r>
           </w:p>
         </w:tc>
@@ -2441,7 +2979,21 @@
               <w:rPr>
                 <w:rFonts w:ascii="Times New Roman" w:hAnsi="Times New Roman" w:cs="Times New Roman"/>
               </w:rPr>
-              <w:t>${lampiran_ket}</w:t>
+              <w:t>${</w:t>
+            </w:r>
+            <w:proofErr w:type="spellStart"/>
+            <w:r>
+              <w:rPr>
+                <w:rFonts w:ascii="Times New Roman" w:hAnsi="Times New Roman" w:cs="Times New Roman"/>
+              </w:rPr>
+              <w:t>lampiran_ket</w:t>
+            </w:r>
+            <w:proofErr w:type="spellEnd"/>
+            <w:r>
+              <w:rPr>
+                <w:rFonts w:ascii="Times New Roman" w:hAnsi="Times New Roman" w:cs="Times New Roman"/>
+              </w:rPr>
+              <w:t>}</w:t>
             </w:r>
           </w:p>
         </w:tc>
@@ -2688,11 +3240,19 @@
                               <w:rFonts w:ascii="Times New Roman" w:hAnsi="Times New Roman" w:cs="Times New Roman"/>
                             </w:rPr>
                           </w:pPr>
+                          <w:proofErr w:type="spellStart"/>
                           <w:r>
                             <w:rPr>
                               <w:rFonts w:ascii="Times New Roman" w:hAnsi="Times New Roman" w:cs="Times New Roman"/>
                             </w:rPr>
-                            <w:t xml:space="preserve">Laporan </w:t>
+                            <w:t>Laporan</w:t>
+                          </w:r>
+                          <w:proofErr w:type="spellEnd"/>
+                          <w:r>
+                            <w:rPr>
+                              <w:rFonts w:ascii="Times New Roman" w:hAnsi="Times New Roman" w:cs="Times New Roman"/>
+                            </w:rPr>
+                            <w:t xml:space="preserve"> </w:t>
                           </w:r>
                           <w:r>
                             <w:rPr>
@@ -2709,12 +3269,14 @@
                               <w:rFonts w:ascii="Times New Roman" w:hAnsi="Times New Roman" w:cs="Times New Roman"/>
                             </w:rPr>
                           </w:pPr>
+                          <w:proofErr w:type="spellStart"/>
                           <w:r>
                             <w:rPr>
                               <w:rFonts w:ascii="Times New Roman" w:hAnsi="Times New Roman" w:cs="Times New Roman"/>
                             </w:rPr>
                             <w:t>Tanggal</w:t>
                           </w:r>
+                          <w:proofErr w:type="spellEnd"/>
                           <w:r>
                             <w:rPr>
                               <w:rFonts w:ascii="Times New Roman" w:hAnsi="Times New Roman" w:cs="Times New Roman"/>
@@ -2725,7 +3287,21 @@
                             <w:rPr>
                               <w:rFonts w:ascii="Times New Roman" w:hAnsi="Times New Roman" w:cs="Times New Roman"/>
                             </w:rPr>
-                            <w:t>02 September 2025</w:t>
+                            <w:t>${</w:t>
+                          </w:r>
+                          <w:proofErr w:type="spellStart"/>
+                          <w:r>
+                            <w:rPr>
+                              <w:rFonts w:ascii="Times New Roman" w:hAnsi="Times New Roman" w:cs="Times New Roman"/>
+                            </w:rPr>
+                            <w:t>tanggal</w:t>
+                          </w:r>
+                          <w:proofErr w:type="spellEnd"/>
+                          <w:r>
+                            <w:rPr>
+                              <w:rFonts w:ascii="Times New Roman" w:hAnsi="Times New Roman" w:cs="Times New Roman"/>
+                            </w:rPr>
+                            <w:t>}</w:t>
                           </w:r>
                         </w:p>
                         <w:p/>
@@ -2766,11 +3342,19 @@
                         <w:rFonts w:ascii="Times New Roman" w:hAnsi="Times New Roman" w:cs="Times New Roman"/>
                       </w:rPr>
                     </w:pPr>
+                    <w:proofErr w:type="spellStart"/>
                     <w:r>
                       <w:rPr>
                         <w:rFonts w:ascii="Times New Roman" w:hAnsi="Times New Roman" w:cs="Times New Roman"/>
                       </w:rPr>
-                      <w:t xml:space="preserve">Laporan </w:t>
+                      <w:t>Laporan</w:t>
+                    </w:r>
+                    <w:proofErr w:type="spellEnd"/>
+                    <w:r>
+                      <w:rPr>
+                        <w:rFonts w:ascii="Times New Roman" w:hAnsi="Times New Roman" w:cs="Times New Roman"/>
+                      </w:rPr>
+                      <w:t xml:space="preserve"> </w:t>
                     </w:r>
                     <w:r>
                       <w:rPr>
@@ -2787,12 +3371,14 @@
                         <w:rFonts w:ascii="Times New Roman" w:hAnsi="Times New Roman" w:cs="Times New Roman"/>
                       </w:rPr>
                     </w:pPr>
+                    <w:proofErr w:type="spellStart"/>
                     <w:r>
                       <w:rPr>
                         <w:rFonts w:ascii="Times New Roman" w:hAnsi="Times New Roman" w:cs="Times New Roman"/>
                       </w:rPr>
                       <w:t>Tanggal</w:t>
                     </w:r>
+                    <w:proofErr w:type="spellEnd"/>
                     <w:r>
                       <w:rPr>
                         <w:rFonts w:ascii="Times New Roman" w:hAnsi="Times New Roman" w:cs="Times New Roman"/>
@@ -2803,7 +3389,21 @@
                       <w:rPr>
                         <w:rFonts w:ascii="Times New Roman" w:hAnsi="Times New Roman" w:cs="Times New Roman"/>
                       </w:rPr>
-                      <w:t>02 September 2025</w:t>
+                      <w:t>${</w:t>
+                    </w:r>
+                    <w:proofErr w:type="spellStart"/>
+                    <w:r>
+                      <w:rPr>
+                        <w:rFonts w:ascii="Times New Roman" w:hAnsi="Times New Roman" w:cs="Times New Roman"/>
+                      </w:rPr>
+                      <w:t>tanggal</w:t>
+                    </w:r>
+                    <w:proofErr w:type="spellEnd"/>
+                    <w:r>
+                      <w:rPr>
+                        <w:rFonts w:ascii="Times New Roman" w:hAnsi="Times New Roman" w:cs="Times New Roman"/>
+                      </w:rPr>
+                      <w:t>}</w:t>
                     </w:r>
                   </w:p>
                   <w:p/>
@@ -3024,7 +3624,7 @@
                                   <pic:cNvPicPr/>
                                 </pic:nvPicPr>
                                 <pic:blipFill>
-                                  <a:blip r:embed="rId3">
+                                  <a:blip r:embed="rId4">
                                     <a:extLst>
                                       <a:ext uri="{28A0092B-C50C-407E-A947-70E740481C1C}">
                                         <a14:useLocalDpi xmlns:a14="http://schemas.microsoft.com/office/drawing/2010/main" val="0"/>
@@ -4545,6 +5145,7 @@
   <w:style w:type="character" w:default="1" w:styleId="DefaultParagraphFont">
     <w:name w:val="Default Paragraph Font"/>
     <w:uiPriority w:val="1"/>
+    <w:semiHidden/>
     <w:unhideWhenUsed/>
   </w:style>
   <w:style w:type="table" w:default="1" w:styleId="TableNormal">

</xml_diff>